<commit_message>
fix: remove unnecessary blank line in Cuenta de Cobro template
</commit_message>
<xml_diff>
--- a/PLANTILLA CUENTA DE COBRO.docx
+++ b/PLANTILLA CUENTA DE COBRO.docx
@@ -1157,18 +1157,6 @@
         </w:tc>
       </w:tr>
     </w:tbl>
-    <w:p>
-      <w:pPr>
-        <w:rPr>
-          <w:rFonts w:ascii="Helvetica" w:hAnsi="Helvetica" w:cs="Helvetica"/>
-          <w:b/>
-          <w:bCs/>
-          <w:sz w:val="22"/>
-          <w:szCs w:val="22"/>
-          <w:lang w:val="es-ES"/>
-        </w:rPr>
-      </w:pPr>
-    </w:p>
     <w:p>
       <w:pPr>
         <w:rPr>
@@ -1562,7 +1550,6 @@
           <w:szCs w:val="22"/>
           <w:lang w:val="es-ES"/>
         </w:rPr>
-        <w:lastRenderedPageBreak/>
         <w:t>_______________________</w:t>
       </w:r>
     </w:p>
@@ -1582,6 +1569,7 @@
           <w:szCs w:val="22"/>
           <w:lang w:val="es-ES"/>
         </w:rPr>
+        <w:lastRenderedPageBreak/>
         <w:t xml:space="preserve">Luis Orlando Ramos Serna </w:t>
       </w:r>
     </w:p>
@@ -3179,6 +3167,7 @@
   <w:style w:type="character" w:default="1" w:styleId="DefaultParagraphFont">
     <w:name w:val="Default Paragraph Font"/>
     <w:uiPriority w:val="1"/>
+    <w:semiHidden/>
     <w:unhideWhenUsed/>
   </w:style>
   <w:style w:type="table" w:default="1" w:styleId="TableNormal">

</xml_diff>

<commit_message>
fix: update templates and export functions to include time fields for better accuracy
Co-authored-by: Copilot <copilot@github.com>
</commit_message>
<xml_diff>
--- a/PLANTILLA CUENTA DE COBRO.docx
+++ b/PLANTILLA CUENTA DE COBRO.docx
@@ -728,11 +728,22 @@
           <w:szCs w:val="22"/>
           <w:lang w:val="es-ES"/>
         </w:rPr>
-        <w:t xml:space="preserve">el día </w:t>
-      </w:r>
-      <w:r>
-        <w:rPr>
-          <w:rFonts w:ascii="Helvetica" w:hAnsi="Helvetica" w:cs="Helvetica"/>
+        <w:t>desde el día</w:t>
+      </w:r>
+      <w:r>
+        <w:rPr>
+          <w:rFonts w:ascii="Helvetica" w:hAnsi="Helvetica" w:cs="Helvetica"/>
+          <w:sz w:val="22"/>
+          <w:szCs w:val="22"/>
+          <w:lang w:val="es-ES"/>
+        </w:rPr>
+        <w:t xml:space="preserve"> </w:t>
+      </w:r>
+      <w:r>
+        <w:rPr>
+          <w:rFonts w:ascii="Helvetica" w:hAnsi="Helvetica" w:cs="Helvetica"/>
+          <w:sz w:val="22"/>
+          <w:szCs w:val="22"/>
           <w:lang w:val="es-ES"/>
         </w:rPr>
         <w:t>{{</w:t>
@@ -741,6 +752,8 @@
       <w:r>
         <w:rPr>
           <w:rFonts w:ascii="Helvetica" w:hAnsi="Helvetica" w:cs="Helvetica"/>
+          <w:sz w:val="22"/>
+          <w:szCs w:val="22"/>
           <w:lang w:val="es-ES"/>
         </w:rPr>
         <w:t>fecha_inicio</w:t>
@@ -749,6 +762,8 @@
       <w:r>
         <w:rPr>
           <w:rFonts w:ascii="Helvetica" w:hAnsi="Helvetica" w:cs="Helvetica"/>
+          <w:sz w:val="22"/>
+          <w:szCs w:val="22"/>
           <w:lang w:val="es-ES"/>
         </w:rPr>
         <w:t>}}</w:t>
@@ -760,13 +775,120 @@
           <w:szCs w:val="22"/>
           <w:lang w:val="es-ES"/>
         </w:rPr>
-        <w:t xml:space="preserve">, para el requerimiento </w:t>
+        <w:t xml:space="preserve"> a las {{</w:t>
+      </w:r>
+      <w:proofErr w:type="spellStart"/>
+      <w:r>
+        <w:rPr>
+          <w:rFonts w:ascii="Helvetica" w:hAnsi="Helvetica" w:cs="Helvetica"/>
+          <w:sz w:val="22"/>
+          <w:szCs w:val="22"/>
+          <w:lang w:val="es-ES"/>
+        </w:rPr>
+        <w:t>hora_inicio</w:t>
+      </w:r>
+      <w:proofErr w:type="spellEnd"/>
+      <w:r>
+        <w:rPr>
+          <w:rFonts w:ascii="Helvetica" w:hAnsi="Helvetica" w:cs="Helvetica"/>
+          <w:sz w:val="22"/>
+          <w:szCs w:val="22"/>
+          <w:lang w:val="es-ES"/>
+        </w:rPr>
+        <w:t>}}</w:t>
+      </w:r>
+      <w:r>
+        <w:rPr>
+          <w:rFonts w:ascii="Helvetica" w:hAnsi="Helvetica" w:cs="Helvetica"/>
+          <w:sz w:val="22"/>
+          <w:szCs w:val="22"/>
+          <w:lang w:val="es-ES"/>
+        </w:rPr>
+        <w:t>,</w:t>
+      </w:r>
+      <w:r>
+        <w:rPr>
+          <w:rFonts w:ascii="Helvetica" w:hAnsi="Helvetica" w:cs="Helvetica"/>
+          <w:sz w:val="22"/>
+          <w:szCs w:val="22"/>
+          <w:lang w:val="es-ES"/>
+        </w:rPr>
+        <w:t xml:space="preserve"> hasta el día {{</w:t>
+      </w:r>
+      <w:proofErr w:type="spellStart"/>
+      <w:r>
+        <w:rPr>
+          <w:rFonts w:ascii="Helvetica" w:hAnsi="Helvetica" w:cs="Helvetica"/>
+          <w:sz w:val="22"/>
+          <w:szCs w:val="22"/>
+          <w:lang w:val="es-ES"/>
+        </w:rPr>
+        <w:t>fecha_fin</w:t>
+      </w:r>
+      <w:proofErr w:type="spellEnd"/>
+      <w:r>
+        <w:rPr>
+          <w:rFonts w:ascii="Helvetica" w:hAnsi="Helvetica" w:cs="Helvetica"/>
+          <w:sz w:val="22"/>
+          <w:szCs w:val="22"/>
+          <w:lang w:val="es-ES"/>
+        </w:rPr>
+        <w:t>}}</w:t>
+      </w:r>
+      <w:r>
+        <w:rPr>
+          <w:rFonts w:ascii="Helvetica" w:hAnsi="Helvetica" w:cs="Helvetica"/>
+          <w:sz w:val="22"/>
+          <w:szCs w:val="22"/>
+          <w:lang w:val="es-ES"/>
+        </w:rPr>
+        <w:t xml:space="preserve"> a las {{</w:t>
+      </w:r>
+      <w:proofErr w:type="spellStart"/>
+      <w:r>
+        <w:rPr>
+          <w:rFonts w:ascii="Helvetica" w:hAnsi="Helvetica" w:cs="Helvetica"/>
+          <w:sz w:val="22"/>
+          <w:szCs w:val="22"/>
+          <w:lang w:val="es-ES"/>
+        </w:rPr>
+        <w:t>hora_fin</w:t>
+      </w:r>
+      <w:proofErr w:type="spellEnd"/>
+      <w:r>
+        <w:rPr>
+          <w:rFonts w:ascii="Helvetica" w:hAnsi="Helvetica" w:cs="Helvetica"/>
+          <w:sz w:val="22"/>
+          <w:szCs w:val="22"/>
+          <w:lang w:val="es-ES"/>
+        </w:rPr>
+        <w:t>}},</w:t>
+      </w:r>
+      <w:r>
+        <w:rPr>
+          <w:rFonts w:ascii="Helvetica" w:hAnsi="Helvetica" w:cs="Helvetica"/>
+          <w:sz w:val="22"/>
+          <w:szCs w:val="22"/>
+          <w:lang w:val="es-ES"/>
+        </w:rPr>
+        <w:t xml:space="preserve"> </w:t>
+      </w:r>
+      <w:r>
+        <w:rPr>
+          <w:rFonts w:ascii="Helvetica" w:hAnsi="Helvetica" w:cs="Helvetica"/>
+          <w:sz w:val="22"/>
+          <w:szCs w:val="22"/>
+          <w:lang w:val="es-ES"/>
+        </w:rPr>
+        <w:t xml:space="preserve">para el requerimiento </w:t>
       </w:r>
       <w:r>
         <w:rPr>
           <w:rFonts w:ascii="Helvetica" w:hAnsi="Helvetica" w:cs="Helvetica"/>
           <w:b/>
           <w:bCs/>
+          <w:sz w:val="22"/>
+          <w:szCs w:val="22"/>
           <w:lang w:val="es-ES"/>
         </w:rPr>
         <w:t>{{</w:t>
@@ -777,6 +899,8 @@
           <w:rFonts w:ascii="Helvetica" w:hAnsi="Helvetica" w:cs="Helvetica"/>
           <w:b/>
           <w:bCs/>
+          <w:sz w:val="22"/>
+          <w:szCs w:val="22"/>
           <w:lang w:val="es-ES"/>
         </w:rPr>
         <w:t>numero_requerimiento</w:t>
@@ -787,6 +911,8 @@
           <w:rFonts w:ascii="Helvetica" w:hAnsi="Helvetica" w:cs="Helvetica"/>
           <w:b/>
           <w:bCs/>
+          <w:sz w:val="22"/>
+          <w:szCs w:val="22"/>
           <w:lang w:val="es-ES"/>
         </w:rPr>
         <w:t xml:space="preserve">}} </w:t>
@@ -803,23 +929,11 @@
       <w:r>
         <w:rPr>
           <w:rFonts w:ascii="Helvetica" w:hAnsi="Helvetica" w:cs="Helvetica"/>
-          <w:lang w:val="es-ES"/>
-        </w:rPr>
-        <w:t>{{municipio}}</w:t>
-      </w:r>
-      <w:r>
-        <w:rPr>
-          <w:rFonts w:ascii="Helvetica" w:hAnsi="Helvetica" w:cs="Helvetica"/>
-          <w:lang w:val="es-ES"/>
-        </w:rPr>
-        <w:t>,</w:t>
-      </w:r>
-      <w:r>
-        <w:rPr>
-          <w:rFonts w:ascii="Helvetica" w:hAnsi="Helvetica" w:cs="Helvetica"/>
-          <w:lang w:val="es-ES"/>
-        </w:rPr>
-        <w:t xml:space="preserve"> {{departamento}}</w:t>
+          <w:sz w:val="22"/>
+          <w:szCs w:val="22"/>
+          <w:lang w:val="es-ES"/>
+        </w:rPr>
+        <w:t>{{municipio}}, {{departamento}}</w:t>
       </w:r>
       <w:r>
         <w:rPr>
@@ -835,18 +949,19 @@
       <w:tblPr>
         <w:tblStyle w:val="TableGrid"/>
         <w:tblW w:w="0" w:type="auto"/>
+        <w:tblLayout w:type="fixed"/>
         <w:tblLook w:val="04A0" w:firstRow="1" w:lastRow="0" w:firstColumn="1" w:lastColumn="0" w:noHBand="0" w:noVBand="1"/>
       </w:tblPr>
       <w:tblGrid>
-        <w:gridCol w:w="2697"/>
-        <w:gridCol w:w="2697"/>
-        <w:gridCol w:w="2698"/>
-        <w:gridCol w:w="2698"/>
+        <w:gridCol w:w="4106"/>
+        <w:gridCol w:w="1276"/>
+        <w:gridCol w:w="2410"/>
+        <w:gridCol w:w="2998"/>
       </w:tblGrid>
       <w:tr>
         <w:tc>
           <w:tcPr>
-            <w:tcW w:w="2697" w:type="dxa"/>
+            <w:tcW w:w="4106" w:type="dxa"/>
             <w:shd w:val="clear" w:color="auto" w:fill="E8E8E8" w:themeFill="background2"/>
           </w:tcPr>
           <w:p>
@@ -868,7 +983,7 @@
         </w:tc>
         <w:tc>
           <w:tcPr>
-            <w:tcW w:w="2697" w:type="dxa"/>
+            <w:tcW w:w="1276" w:type="dxa"/>
             <w:shd w:val="clear" w:color="auto" w:fill="E8E8E8" w:themeFill="background2"/>
           </w:tcPr>
           <w:p>
@@ -890,7 +1005,7 @@
         </w:tc>
         <w:tc>
           <w:tcPr>
-            <w:tcW w:w="2698" w:type="dxa"/>
+            <w:tcW w:w="2410" w:type="dxa"/>
             <w:shd w:val="clear" w:color="auto" w:fill="E8E8E8" w:themeFill="background2"/>
           </w:tcPr>
           <w:p>
@@ -912,7 +1027,7 @@
         </w:tc>
         <w:tc>
           <w:tcPr>
-            <w:tcW w:w="2698" w:type="dxa"/>
+            <w:tcW w:w="2998" w:type="dxa"/>
             <w:shd w:val="clear" w:color="auto" w:fill="E8E8E8" w:themeFill="background2"/>
           </w:tcPr>
           <w:p>
@@ -936,40 +1051,39 @@
       <w:tr>
         <w:tc>
           <w:tcPr>
-            <w:tcW w:w="2697" w:type="dxa"/>
+            <w:tcW w:w="4106" w:type="dxa"/>
           </w:tcPr>
           <w:p>
             <w:pPr>
               <w:rPr>
                 <w:rFonts w:ascii="Helvetica" w:hAnsi="Helvetica" w:cs="Helvetica"/>
-                <w:lang w:val="es-ES"/>
               </w:rPr>
             </w:pPr>
             <w:r>
               <w:rPr>
                 <w:rFonts w:ascii="Helvetica" w:hAnsi="Helvetica" w:cs="Helvetica"/>
               </w:rPr>
-              <w:t>{{#items}} {{</w:t>
-            </w:r>
-            <w:proofErr w:type="spellStart"/>
+              <w:t>{{#items</w:t>
+            </w:r>
+            <w:proofErr w:type="gramStart"/>
             <w:r>
               <w:rPr>
                 <w:rFonts w:ascii="Helvetica" w:hAnsi="Helvetica" w:cs="Helvetica"/>
               </w:rPr>
-              <w:t>descripcion</w:t>
-            </w:r>
-            <w:proofErr w:type="spellEnd"/>
+              <w:t>}}{</w:t>
+            </w:r>
+            <w:proofErr w:type="gramEnd"/>
             <w:r>
               <w:rPr>
                 <w:rFonts w:ascii="Helvetica" w:hAnsi="Helvetica" w:cs="Helvetica"/>
               </w:rPr>
-              <w:t>}}</w:t>
+              <w:t>{descripcion}}</w:t>
             </w:r>
           </w:p>
         </w:tc>
         <w:tc>
           <w:tcPr>
-            <w:tcW w:w="2697" w:type="dxa"/>
+            <w:tcW w:w="1276" w:type="dxa"/>
           </w:tcPr>
           <w:p>
             <w:pPr>
@@ -1003,7 +1117,7 @@
         </w:tc>
         <w:tc>
           <w:tcPr>
-            <w:tcW w:w="2698" w:type="dxa"/>
+            <w:tcW w:w="2410" w:type="dxa"/>
           </w:tcPr>
           <w:p>
             <w:pPr>
@@ -1043,7 +1157,7 @@
         </w:tc>
         <w:tc>
           <w:tcPr>
-            <w:tcW w:w="2698" w:type="dxa"/>
+            <w:tcW w:w="2998" w:type="dxa"/>
           </w:tcPr>
           <w:p>
             <w:pPr>
@@ -1057,12 +1171,18 @@
               <w:rPr>
                 <w:rFonts w:ascii="Helvetica" w:hAnsi="Helvetica" w:cs="Helvetica"/>
               </w:rPr>
-              <w:t xml:space="preserve">$ </w:t>
+              <w:t>$</w:t>
             </w:r>
             <w:r>
               <w:rPr>
                 <w:rFonts w:ascii="Helvetica" w:hAnsi="Helvetica" w:cs="Helvetica"/>
               </w:rPr>
+              <w:t xml:space="preserve"> </w:t>
+            </w:r>
+            <w:r>
+              <w:rPr>
+                <w:rFonts w:ascii="Helvetica" w:hAnsi="Helvetica" w:cs="Helvetica"/>
+              </w:rPr>
               <w:t>{{</w:t>
             </w:r>
             <w:proofErr w:type="spellStart"/>
@@ -1070,28 +1190,22 @@
               <w:rPr>
                 <w:rFonts w:ascii="Helvetica" w:hAnsi="Helvetica" w:cs="Helvetica"/>
               </w:rPr>
-              <w:t>precio_</w:t>
-            </w:r>
+              <w:t>precio_total</w:t>
+            </w:r>
+            <w:proofErr w:type="spellEnd"/>
             <w:proofErr w:type="gramStart"/>
             <w:r>
               <w:rPr>
                 <w:rFonts w:ascii="Helvetica" w:hAnsi="Helvetica" w:cs="Helvetica"/>
               </w:rPr>
-              <w:t>total</w:t>
-            </w:r>
-            <w:proofErr w:type="spellEnd"/>
+              <w:t>}}{</w:t>
+            </w:r>
+            <w:proofErr w:type="gramEnd"/>
             <w:r>
               <w:rPr>
                 <w:rFonts w:ascii="Helvetica" w:hAnsi="Helvetica" w:cs="Helvetica"/>
               </w:rPr>
-              <w:t>}} {{/</w:t>
-            </w:r>
-            <w:proofErr w:type="gramEnd"/>
-            <w:r>
-              <w:rPr>
-                <w:rFonts w:ascii="Helvetica" w:hAnsi="Helvetica" w:cs="Helvetica"/>
-              </w:rPr>
-              <w:t>items}}</w:t>
+              <w:t>{/items}}</w:t>
             </w:r>
           </w:p>
         </w:tc>
@@ -1099,7 +1213,7 @@
       <w:tr>
         <w:tc>
           <w:tcPr>
-            <w:tcW w:w="8092" w:type="dxa"/>
+            <w:tcW w:w="7792" w:type="dxa"/>
             <w:gridSpan w:val="3"/>
             <w:shd w:val="clear" w:color="auto" w:fill="E8E8E8" w:themeFill="background2"/>
           </w:tcPr>
@@ -1120,14 +1234,13 @@
         </w:tc>
         <w:tc>
           <w:tcPr>
-            <w:tcW w:w="2698" w:type="dxa"/>
+            <w:tcW w:w="2998" w:type="dxa"/>
           </w:tcPr>
           <w:p>
             <w:pPr>
               <w:jc w:val="center"/>
               <w:rPr>
                 <w:rFonts w:ascii="Helvetica" w:hAnsi="Helvetica" w:cs="Helvetica"/>
-                <w:lang w:val="es-ES"/>
               </w:rPr>
             </w:pPr>
             <w:r>
@@ -1135,15 +1248,21 @@
                 <w:rFonts w:ascii="Helvetica" w:hAnsi="Helvetica" w:cs="Helvetica"/>
                 <w:lang w:val="es-ES"/>
               </w:rPr>
-              <w:t>$ {{</w:t>
+              <w:t xml:space="preserve">$ </w:t>
+            </w:r>
+            <w:r>
+              <w:rPr>
+                <w:rFonts w:ascii="Helvetica" w:hAnsi="Helvetica" w:cs="Helvetica"/>
+                <w:lang w:val="es-ES"/>
+              </w:rPr>
+              <w:t>{{</w:t>
             </w:r>
             <w:proofErr w:type="spellStart"/>
             <w:r>
               <w:rPr>
                 <w:rFonts w:ascii="Helvetica" w:hAnsi="Helvetica" w:cs="Helvetica"/>
-                <w:lang w:val="es-ES"/>
-              </w:rPr>
-              <w:t>subtotal_servicios</w:t>
+              </w:rPr>
+              <w:t>gran_total</w:t>
             </w:r>
             <w:proofErr w:type="spellEnd"/>
             <w:r>
@@ -1151,7 +1270,14 @@
                 <w:rFonts w:ascii="Helvetica" w:hAnsi="Helvetica" w:cs="Helvetica"/>
                 <w:lang w:val="es-ES"/>
               </w:rPr>
-              <w:t>}}</w:t>
+              <w:t>}</w:t>
+            </w:r>
+            <w:r>
+              <w:rPr>
+                <w:rFonts w:ascii="Helvetica" w:hAnsi="Helvetica" w:cs="Helvetica"/>
+                <w:lang w:val="es-ES"/>
+              </w:rPr>
+              <w:t>}</w:t>
             </w:r>
           </w:p>
         </w:tc>
@@ -1209,6 +1335,154 @@
     </w:p>
     <w:p>
       <w:pPr>
+        <w:spacing w:after="0"/>
+        <w:rPr>
+          <w:rFonts w:ascii="Helvetica" w:hAnsi="Helvetica" w:cs="Helvetica"/>
+          <w:b/>
+          <w:bCs/>
+          <w:sz w:val="22"/>
+          <w:szCs w:val="22"/>
+          <w:lang w:val="es-ES"/>
+        </w:rPr>
+      </w:pPr>
+      <w:r>
+        <w:rPr>
+          <w:rFonts w:ascii="Helvetica" w:hAnsi="Helvetica" w:cs="Helvetica"/>
+          <w:b/>
+          <w:bCs/>
+          <w:sz w:val="22"/>
+          <w:szCs w:val="22"/>
+          <w:lang w:val="es-ES"/>
+        </w:rPr>
+        <w:t>INFORMACIÓN PARA EL PAGO:</w:t>
+      </w:r>
+    </w:p>
+    <w:p>
+      <w:pPr>
+        <w:spacing w:after="0"/>
+        <w:rPr>
+          <w:rFonts w:ascii="Helvetica" w:hAnsi="Helvetica" w:cs="Helvetica"/>
+          <w:sz w:val="22"/>
+          <w:szCs w:val="22"/>
+          <w:lang w:val="es-ES"/>
+        </w:rPr>
+      </w:pPr>
+      <w:r>
+        <w:rPr>
+          <w:rFonts w:ascii="Helvetica" w:hAnsi="Helvetica" w:cs="Helvetica"/>
+          <w:b/>
+          <w:bCs/>
+          <w:sz w:val="22"/>
+          <w:szCs w:val="22"/>
+          <w:lang w:val="es-ES"/>
+        </w:rPr>
+        <w:t xml:space="preserve">Forma de pago: </w:t>
+      </w:r>
+      <w:r>
+        <w:rPr>
+          <w:rFonts w:ascii="Helvetica" w:hAnsi="Helvetica" w:cs="Helvetica"/>
+          <w:sz w:val="22"/>
+          <w:szCs w:val="22"/>
+          <w:lang w:val="es-ES"/>
+        </w:rPr>
+        <w:t>Transferencia bancaria</w:t>
+      </w:r>
+    </w:p>
+    <w:p>
+      <w:pPr>
+        <w:spacing w:after="0"/>
+        <w:rPr>
+          <w:rFonts w:ascii="Helvetica" w:hAnsi="Helvetica" w:cs="Helvetica"/>
+          <w:sz w:val="22"/>
+          <w:szCs w:val="22"/>
+          <w:lang w:val="es-ES"/>
+        </w:rPr>
+      </w:pPr>
+      <w:r>
+        <w:rPr>
+          <w:rFonts w:ascii="Helvetica" w:hAnsi="Helvetica" w:cs="Helvetica"/>
+          <w:b/>
+          <w:bCs/>
+          <w:sz w:val="22"/>
+          <w:szCs w:val="22"/>
+          <w:lang w:val="es-ES"/>
+        </w:rPr>
+        <w:t xml:space="preserve">Banco: </w:t>
+      </w:r>
+      <w:r>
+        <w:rPr>
+          <w:rFonts w:ascii="Helvetica" w:hAnsi="Helvetica" w:cs="Helvetica"/>
+          <w:sz w:val="22"/>
+          <w:szCs w:val="22"/>
+          <w:lang w:val="es-ES"/>
+        </w:rPr>
+        <w:t>Bancolombia</w:t>
+      </w:r>
+    </w:p>
+    <w:p>
+      <w:pPr>
+        <w:spacing w:after="0"/>
+        <w:rPr>
+          <w:rFonts w:ascii="Helvetica" w:hAnsi="Helvetica" w:cs="Helvetica"/>
+          <w:sz w:val="22"/>
+          <w:szCs w:val="22"/>
+          <w:lang w:val="es-ES"/>
+        </w:rPr>
+      </w:pPr>
+      <w:r>
+        <w:rPr>
+          <w:rFonts w:ascii="Helvetica" w:hAnsi="Helvetica" w:cs="Helvetica"/>
+          <w:b/>
+          <w:bCs/>
+          <w:sz w:val="22"/>
+          <w:szCs w:val="22"/>
+          <w:lang w:val="es-ES"/>
+        </w:rPr>
+        <w:t xml:space="preserve">Tipo de cuenta: </w:t>
+      </w:r>
+      <w:r>
+        <w:rPr>
+          <w:rFonts w:ascii="Helvetica" w:hAnsi="Helvetica" w:cs="Helvetica"/>
+          <w:sz w:val="22"/>
+          <w:szCs w:val="22"/>
+          <w:lang w:val="es-ES"/>
+        </w:rPr>
+        <w:t>Ahorros</w:t>
+      </w:r>
+    </w:p>
+    <w:p>
+      <w:pPr>
+        <w:spacing w:after="0"/>
+        <w:rPr>
+          <w:rFonts w:ascii="Helvetica" w:hAnsi="Helvetica" w:cs="Helvetica"/>
+          <w:sz w:val="22"/>
+          <w:szCs w:val="22"/>
+          <w:lang w:val="es-ES"/>
+        </w:rPr>
+      </w:pPr>
+      <w:r>
+        <w:rPr>
+          <w:rFonts w:ascii="Helvetica" w:hAnsi="Helvetica" w:cs="Helvetica"/>
+          <w:b/>
+          <w:bCs/>
+          <w:sz w:val="22"/>
+          <w:szCs w:val="22"/>
+          <w:lang w:val="es-ES"/>
+        </w:rPr>
+        <w:t xml:space="preserve">Número de cuenta: </w:t>
+      </w:r>
+      <w:r>
+        <w:rPr>
+          <w:rFonts w:ascii="Helvetica" w:hAnsi="Helvetica" w:cs="Helvetica"/>
+          <w:sz w:val="22"/>
+          <w:szCs w:val="22"/>
+          <w:lang w:val="es-ES"/>
+        </w:rPr>
+        <w:t>253 623661 89</w:t>
+      </w:r>
+    </w:p>
+    <w:p>
+      <w:pPr>
         <w:rPr>
           <w:rFonts w:ascii="Helvetica" w:hAnsi="Helvetica" w:cs="Helvetica"/>
           <w:sz w:val="22"/>
@@ -1221,8 +1495,6 @@
       <w:pPr>
         <w:rPr>
           <w:rFonts w:ascii="Helvetica" w:hAnsi="Helvetica" w:cs="Helvetica"/>
-          <w:b/>
-          <w:bCs/>
           <w:sz w:val="22"/>
           <w:szCs w:val="22"/>
           <w:lang w:val="es-ES"/>
@@ -1231,157 +1503,6 @@
       <w:r>
         <w:rPr>
           <w:rFonts w:ascii="Helvetica" w:hAnsi="Helvetica" w:cs="Helvetica"/>
-          <w:b/>
-          <w:bCs/>
-          <w:sz w:val="22"/>
-          <w:szCs w:val="22"/>
-          <w:lang w:val="es-ES"/>
-        </w:rPr>
-        <w:t>INFORMACIÓN PARA EL PAGO:</w:t>
-      </w:r>
-    </w:p>
-    <w:p>
-      <w:pPr>
-        <w:rPr>
-          <w:rFonts w:ascii="Helvetica" w:hAnsi="Helvetica" w:cs="Helvetica"/>
-          <w:sz w:val="22"/>
-          <w:szCs w:val="22"/>
-          <w:lang w:val="es-ES"/>
-        </w:rPr>
-      </w:pPr>
-      <w:r>
-        <w:rPr>
-          <w:rFonts w:ascii="Helvetica" w:hAnsi="Helvetica" w:cs="Helvetica"/>
-          <w:b/>
-          <w:bCs/>
-          <w:sz w:val="22"/>
-          <w:szCs w:val="22"/>
-          <w:lang w:val="es-ES"/>
-        </w:rPr>
-        <w:t xml:space="preserve">Forma de pago: </w:t>
-      </w:r>
-      <w:r>
-        <w:rPr>
-          <w:rFonts w:ascii="Helvetica" w:hAnsi="Helvetica" w:cs="Helvetica"/>
-          <w:sz w:val="22"/>
-          <w:szCs w:val="22"/>
-          <w:lang w:val="es-ES"/>
-        </w:rPr>
-        <w:t>Transferencia bancaria</w:t>
-      </w:r>
-    </w:p>
-    <w:p>
-      <w:pPr>
-        <w:rPr>
-          <w:rFonts w:ascii="Helvetica" w:hAnsi="Helvetica" w:cs="Helvetica"/>
-          <w:sz w:val="22"/>
-          <w:szCs w:val="22"/>
-          <w:lang w:val="es-ES"/>
-        </w:rPr>
-      </w:pPr>
-      <w:r>
-        <w:rPr>
-          <w:rFonts w:ascii="Helvetica" w:hAnsi="Helvetica" w:cs="Helvetica"/>
-          <w:b/>
-          <w:bCs/>
-          <w:sz w:val="22"/>
-          <w:szCs w:val="22"/>
-          <w:lang w:val="es-ES"/>
-        </w:rPr>
-        <w:t xml:space="preserve">Banco: </w:t>
-      </w:r>
-      <w:r>
-        <w:rPr>
-          <w:rFonts w:ascii="Helvetica" w:hAnsi="Helvetica" w:cs="Helvetica"/>
-          <w:sz w:val="22"/>
-          <w:szCs w:val="22"/>
-          <w:lang w:val="es-ES"/>
-        </w:rPr>
-        <w:t>Bancolombia</w:t>
-      </w:r>
-    </w:p>
-    <w:p>
-      <w:pPr>
-        <w:rPr>
-          <w:rFonts w:ascii="Helvetica" w:hAnsi="Helvetica" w:cs="Helvetica"/>
-          <w:sz w:val="22"/>
-          <w:szCs w:val="22"/>
-          <w:lang w:val="es-ES"/>
-        </w:rPr>
-      </w:pPr>
-      <w:r>
-        <w:rPr>
-          <w:rFonts w:ascii="Helvetica" w:hAnsi="Helvetica" w:cs="Helvetica"/>
-          <w:b/>
-          <w:bCs/>
-          <w:sz w:val="22"/>
-          <w:szCs w:val="22"/>
-          <w:lang w:val="es-ES"/>
-        </w:rPr>
-        <w:t xml:space="preserve">Tipo de cuenta: </w:t>
-      </w:r>
-      <w:r>
-        <w:rPr>
-          <w:rFonts w:ascii="Helvetica" w:hAnsi="Helvetica" w:cs="Helvetica"/>
-          <w:sz w:val="22"/>
-          <w:szCs w:val="22"/>
-          <w:lang w:val="es-ES"/>
-        </w:rPr>
-        <w:t>Ahorros</w:t>
-      </w:r>
-    </w:p>
-    <w:p>
-      <w:pPr>
-        <w:rPr>
-          <w:rFonts w:ascii="Helvetica" w:hAnsi="Helvetica" w:cs="Helvetica"/>
-          <w:sz w:val="22"/>
-          <w:szCs w:val="22"/>
-          <w:lang w:val="es-ES"/>
-        </w:rPr>
-      </w:pPr>
-      <w:r>
-        <w:rPr>
-          <w:rFonts w:ascii="Helvetica" w:hAnsi="Helvetica" w:cs="Helvetica"/>
-          <w:b/>
-          <w:bCs/>
-          <w:sz w:val="22"/>
-          <w:szCs w:val="22"/>
-          <w:lang w:val="es-ES"/>
-        </w:rPr>
-        <w:t xml:space="preserve">Número de cuenta: </w:t>
-      </w:r>
-      <w:r>
-        <w:rPr>
-          <w:rFonts w:ascii="Helvetica" w:hAnsi="Helvetica" w:cs="Helvetica"/>
-          <w:sz w:val="22"/>
-          <w:szCs w:val="22"/>
-          <w:lang w:val="es-ES"/>
-        </w:rPr>
-        <w:t>253 623661 89</w:t>
-      </w:r>
-    </w:p>
-    <w:p>
-      <w:pPr>
-        <w:rPr>
-          <w:rFonts w:ascii="Helvetica" w:hAnsi="Helvetica" w:cs="Helvetica"/>
-          <w:sz w:val="22"/>
-          <w:szCs w:val="22"/>
-          <w:lang w:val="es-ES"/>
-        </w:rPr>
-      </w:pPr>
-    </w:p>
-    <w:p>
-      <w:pPr>
-        <w:rPr>
-          <w:rFonts w:ascii="Helvetica" w:hAnsi="Helvetica" w:cs="Helvetica"/>
-          <w:sz w:val="22"/>
-          <w:szCs w:val="22"/>
-          <w:lang w:val="es-ES"/>
-        </w:rPr>
-      </w:pPr>
-      <w:r>
-        <w:rPr>
-          <w:rFonts w:ascii="Helvetica" w:hAnsi="Helvetica" w:cs="Helvetica"/>
           <w:sz w:val="22"/>
           <w:szCs w:val="22"/>
           <w:lang w:val="es-ES"/>
@@ -1401,7 +1522,14 @@
           <w:rFonts w:ascii="Helvetica" w:hAnsi="Helvetica" w:cs="Helvetica"/>
           <w:lang w:val="es-ES"/>
         </w:rPr>
-        <w:t>created_at</w:t>
+        <w:t>cotizacion_</w:t>
+      </w:r>
+      <w:r>
+        <w:rPr>
+          <w:rFonts w:ascii="Helvetica" w:hAnsi="Helvetica" w:cs="Helvetica"/>
+          <w:lang w:val="es-ES"/>
+        </w:rPr>
+        <w:t>fecha</w:t>
       </w:r>
       <w:proofErr w:type="spellEnd"/>
       <w:r>
@@ -1409,7 +1537,14 @@
           <w:rFonts w:ascii="Helvetica" w:hAnsi="Helvetica" w:cs="Helvetica"/>
           <w:lang w:val="es-ES"/>
         </w:rPr>
-        <w:t>}}</w:t>
+        <w:t>}</w:t>
+      </w:r>
+      <w:r>
+        <w:rPr>
+          <w:rFonts w:ascii="Helvetica" w:hAnsi="Helvetica" w:cs="Helvetica"/>
+          <w:lang w:val="es-ES"/>
+        </w:rPr>
+        <w:t>}</w:t>
       </w:r>
       <w:r>
         <w:rPr>
@@ -1569,7 +1704,6 @@
           <w:szCs w:val="22"/>
           <w:lang w:val="es-ES"/>
         </w:rPr>
-        <w:lastRenderedPageBreak/>
         <w:t xml:space="preserve">Luis Orlando Ramos Serna </w:t>
       </w:r>
     </w:p>
@@ -1760,31 +1894,11 @@
     </w:r>
     <w:r>
       <w:rPr>
-        <w:b/>
-        <w:bCs/>
-        <w:i/>
-        <w:iCs/>
-        <w:color w:val="3A3A3A" w:themeColor="background2" w:themeShade="40"/>
-        <w:lang w:val="es-ES"/>
-      </w:rPr>
-      <w:t>Nota</w:t>
-    </w:r>
-    <w:r>
-      <w:rPr>
-        <w:i/>
-        <w:iCs/>
-        <w:color w:val="3A3A3A" w:themeColor="background2" w:themeShade="40"/>
-        <w:lang w:val="es-ES"/>
-      </w:rPr>
-      <w:t>: Manifiesto bajo la gravedad del juramento que me acojo a lo dispuesto en el numeral 4 del artículo 383 del Estatuto Tributario, y que no he contratado o vinculado a dos (2) o más trabajadores o contratistas asociados a mi actividad por un término igual o superior a noventa (90) días continuos o discontinuos</w:t>
-    </w:r>
-    <w:r>
-      <w:rPr>
         <w:i/>
         <w:iCs/>
         <w:lang w:val="es-ES"/>
       </w:rPr>
-      <w:t xml:space="preserve">. </w:t>
+      <w:t xml:space="preserve"> </w:t>
     </w:r>
   </w:p>
 </w:ftr>
@@ -3167,7 +3281,6 @@
   <w:style w:type="character" w:default="1" w:styleId="DefaultParagraphFont">
     <w:name w:val="Default Paragraph Font"/>
     <w:uiPriority w:val="1"/>
-    <w:semiHidden/>
     <w:unhideWhenUsed/>
   </w:style>
   <w:style w:type="table" w:default="1" w:styleId="TableNormal">

</xml_diff>